<commit_message>
Re-publish Football Week 5 plan with September labeling and Oct 5–9 next week
</commit_message>
<xml_diff>
--- a/weekly-plans/PE-Weekly-Plan-Sept-28-Oct-2-2026-Football-Week-5.docx
+++ b/weekly-plans/PE-Weekly-Plan-Sept-28-Oct-2-2026-Football-Week-5.docx
@@ -47,7 +47,7 @@
           <w:b w:val="0"/>
           <w:sz w:val="22"/>
         </w:rPr>
-        <w:t>Theme: Football Week 5 (school week) — SCA PE Playbook October Week 1 skill sequence: safe flag/two-hand touch, routes (go/out/curl), end-zone catch. Three teaching days; fold apply options into Thu.</w:t>
+        <w:t>Theme: Football Week 5 (school week) — SCA PE Playbook September Week 5 skill sequence: safe flag/two-hand touch, routes (go/out/curl), end-zone catch. Three teaching days; fold apply options into Thu.</w:t>
       </w:r>
     </w:p>
     <w:p>
@@ -2857,7 +2857,7 @@
           <w:b w:val="0"/>
           <w:sz w:val="22"/>
         </w:rPr>
-        <w:t>wu = warm-up · cd = cool-down. School Week 5 (Sept 28–Oct 2); skill sequence matches SCA PE Playbook October Week 1 football (flag/routes/end-zone). Does not replace website lessons.</w:t>
+        <w:t>wu = warm-up · cd = cool-down. School Week 5 (Sept 28–Oct 2); skill sequence matches SCA PE Playbook September Week 5 football (flag/routes/end-zone). Does not replace website lessons.</w:t>
       </w:r>
     </w:p>
     <w:p>
@@ -2877,7 +2877,7 @@
           <w:b w:val="0"/>
           <w:sz w:val="22"/>
         </w:rPr>
-        <w:t>Builds on Week 4 football intro (hike, catch, throw, move to the catch). Next full teaching week after Oct 2 PL: Oct 6–10 (continue October football Week 2: pitch/hand-off, defend the lane, small-sided flag).</w:t>
+        <w:t>Builds on Week 4 football intro (hike, catch, throw, move to the catch). Next full teaching week after Oct 2 PL: Oct 5–9 (Football Week 6 / October Week 1: pitch/hand-off, defend the lane, small-sided flag).</w:t>
       </w:r>
     </w:p>
     <w:p>

</xml_diff>